<commit_message>
Add landing page + multi-user task board with Google Sheets backend
</commit_message>
<xml_diff>
--- a/0 - Tasks/ตารางปฏิทินกิจกรรม.docx
+++ b/0 - Tasks/ตารางปฏิทินกิจกรรม.docx
@@ -199,7 +199,7 @@
           <w:p>
             <w:pPr>
               <w:rPr>
-                <w:rFonts w:ascii="Tahoma" w:hAnsi="Tahoma" w:cs="Tahoma" w:hint="cs"/>
+                <w:rFonts w:ascii="Tahoma" w:hAnsi="Tahoma" w:cs="Tahoma"/>
                 <w:sz w:val="18"/>
                 <w:szCs w:val="18"/>
                 <w:cs/>
@@ -253,7 +253,7 @@
           <w:p>
             <w:pPr>
               <w:rPr>
-                <w:rFonts w:ascii="Tahoma" w:hAnsi="Tahoma" w:cs="Tahoma" w:hint="cs"/>
+                <w:rFonts w:ascii="Tahoma" w:hAnsi="Tahoma" w:cs="Tahoma"/>
                 <w:sz w:val="18"/>
                 <w:szCs w:val="18"/>
                 <w:cs/>
@@ -341,7 +341,7 @@
           <w:p>
             <w:pPr>
               <w:rPr>
-                <w:rFonts w:ascii="Tahoma" w:hAnsi="Tahoma" w:cs="Tahoma" w:hint="cs"/>
+                <w:rFonts w:ascii="Tahoma" w:hAnsi="Tahoma" w:cs="Tahoma"/>
                 <w:sz w:val="18"/>
                 <w:szCs w:val="18"/>
                 <w:cs/>
@@ -372,7 +372,7 @@
           <w:p>
             <w:pPr>
               <w:rPr>
-                <w:rFonts w:ascii="Tahoma" w:hAnsi="Tahoma" w:cs="Tahoma" w:hint="cs"/>
+                <w:rFonts w:ascii="Tahoma" w:hAnsi="Tahoma" w:cs="Tahoma"/>
                 <w:b/>
                 <w:bCs/>
                 <w:sz w:val="18"/>
@@ -726,7 +726,7 @@
           <w:p>
             <w:pPr>
               <w:rPr>
-                <w:rFonts w:ascii="Tahoma" w:hAnsi="Tahoma" w:cs="Tahoma" w:hint="cs"/>
+                <w:rFonts w:ascii="Tahoma" w:hAnsi="Tahoma" w:cs="Tahoma"/>
                 <w:sz w:val="18"/>
                 <w:szCs w:val="18"/>
                 <w:cs/>
@@ -1342,7 +1342,7 @@
           <w:p>
             <w:pPr>
               <w:rPr>
-                <w:rFonts w:ascii="Tahoma" w:hAnsi="Tahoma" w:cs="Tahoma" w:hint="cs"/>
+                <w:rFonts w:ascii="Tahoma" w:hAnsi="Tahoma" w:cs="Tahoma"/>
                 <w:sz w:val="18"/>
                 <w:szCs w:val="18"/>
               </w:rPr>
@@ -1756,13 +1756,6 @@
             </w:tcBorders>
           </w:tcPr>
           <w:p>
-            <w:pPr>
-              <w:rPr>
-                <w:rFonts w:ascii="Tahoma" w:hAnsi="Tahoma" w:cs="Tahoma"/>
-                <w:sz w:val="18"/>
-                <w:szCs w:val="18"/>
-              </w:rPr>
-            </w:pPr>
             <w:hyperlink r:id="rId12" w:history="1">
               <w:r>
                 <w:rPr>
@@ -1785,6 +1778,66 @@
               </w:r>
             </w:hyperlink>
           </w:p>
+          <w:p>
+            <w:pPr>
+              <w:rPr>
+                <w:rFonts w:ascii="Tahoma" w:hAnsi="Tahoma" w:cs="Tahoma"/>
+                <w:sz w:val="18"/>
+                <w:szCs w:val="18"/>
+              </w:rPr>
+            </w:pPr>
+            <w:r>
+              <w:rPr>
+                <w:rFonts w:ascii="Tahoma" w:hAnsi="Tahoma" w:cs="Tahoma"/>
+                <w:sz w:val="18"/>
+                <w:szCs w:val="18"/>
+                <w:cs/>
+              </w:rPr>
+              <w:t xml:space="preserve">(พัสดุ </w:t>
+            </w:r>
+            <w:r>
+              <w:rPr>
+                <w:rFonts w:ascii="Tahoma" w:hAnsi="Tahoma" w:cs="Tahoma"/>
+                <w:sz w:val="18"/>
+                <w:szCs w:val="18"/>
+              </w:rPr>
+              <w:t xml:space="preserve">3 </w:t>
+            </w:r>
+            <w:r>
+              <w:rPr>
+                <w:rFonts w:ascii="Tahoma" w:hAnsi="Tahoma" w:cs="Tahoma"/>
+                <w:sz w:val="18"/>
+                <w:szCs w:val="18"/>
+                <w:cs/>
+              </w:rPr>
+              <w:t>วัน)</w:t>
+            </w:r>
+            <w:r>
+              <w:rPr>
+                <w:rFonts w:ascii="Tahoma" w:hAnsi="Tahoma" w:cs="Tahoma"/>
+                <w:sz w:val="18"/>
+                <w:szCs w:val="18"/>
+              </w:rPr>
+              <w:t xml:space="preserve"> </w:t>
+            </w:r>
+            <w:r>
+              <w:rPr>
+                <w:rFonts w:ascii="Tahoma" w:hAnsi="Tahoma" w:cs="Tahoma" w:hint="cs"/>
+                <w:sz w:val="18"/>
+                <w:szCs w:val="18"/>
+                <w:cs/>
+              </w:rPr>
+              <w:t xml:space="preserve">ต้องเสร็จก่อนเปิดเทอม </w:t>
+            </w:r>
+            <w:r>
+              <w:rPr>
+                <w:rFonts w:ascii="Tahoma" w:hAnsi="Tahoma" w:cs="Tahoma"/>
+                <w:sz w:val="18"/>
+                <w:szCs w:val="18"/>
+              </w:rPr>
+              <w:t>1w</w:t>
+            </w:r>
+          </w:p>
         </w:tc>
       </w:tr>
       <w:tr>
@@ -2723,11 +2776,42 @@
           <w:p>
             <w:pPr>
               <w:rPr>
+                <w:rFonts w:ascii="Tahoma" w:hAnsi="Tahoma" w:cs="Tahoma"/>
+                <w:color w:val="F14124" w:themeColor="accent6"/>
+                <w:sz w:val="18"/>
+                <w:szCs w:val="18"/>
+              </w:rPr>
+            </w:pPr>
+            <w:r>
+              <w:rPr>
                 <w:rFonts w:ascii="Tahoma" w:hAnsi="Tahoma" w:cs="Tahoma" w:hint="cs"/>
-                <w:sz w:val="18"/>
-                <w:szCs w:val="18"/>
-              </w:rPr>
-            </w:pPr>
+                <w:color w:val="F14124" w:themeColor="accent6"/>
+                <w:sz w:val="18"/>
+                <w:szCs w:val="18"/>
+                <w:cs/>
+              </w:rPr>
+              <w:t>บันทึกข้อความ</w:t>
+            </w:r>
+            <w:r>
+              <w:rPr>
+                <w:rFonts w:ascii="Tahoma" w:hAnsi="Tahoma" w:cs="Tahoma" w:hint="cs"/>
+                <w:color w:val="F14124" w:themeColor="accent6"/>
+                <w:sz w:val="18"/>
+                <w:szCs w:val="18"/>
+                <w:cs/>
+              </w:rPr>
+              <w:t>แนบท้าย</w:t>
+            </w:r>
+            <w:r>
+              <w:rPr>
+                <w:rFonts w:ascii="Tahoma" w:hAnsi="Tahoma" w:cs="Tahoma" w:hint="cs"/>
+                <w:color w:val="F14124" w:themeColor="accent6"/>
+                <w:sz w:val="18"/>
+                <w:szCs w:val="18"/>
+                <w:cs/>
+              </w:rPr>
+              <w:t>กรณีที่เบิกไม่เต็ม</w:t>
+            </w:r>
           </w:p>
           <w:p>
             <w:pPr>
@@ -2899,29 +2983,46 @@
           <w:p>
             <w:pPr>
               <w:rPr>
+                <w:rFonts w:ascii="Tahoma" w:hAnsi="Tahoma" w:cs="Tahoma"/>
+                <w:sz w:val="18"/>
+                <w:szCs w:val="18"/>
+                <w:cs/>
+              </w:rPr>
+            </w:pPr>
+            <w:r>
+              <w:rPr>
+                <w:rFonts w:ascii="Tahoma" w:hAnsi="Tahoma" w:cs="Tahoma"/>
+                <w:sz w:val="18"/>
+                <w:szCs w:val="18"/>
+                <w:cs/>
+              </w:rPr>
+              <w:t>รวมเอกสาร</w:t>
+            </w:r>
+            <w:r>
+              <w:rPr>
+                <w:rFonts w:ascii="Tahoma" w:hAnsi="Tahoma" w:cs="Tahoma"/>
+                <w:sz w:val="18"/>
+                <w:szCs w:val="18"/>
+                <w:cs/>
+              </w:rPr>
+              <w:t>ส่งให้พัสดุ</w:t>
+            </w:r>
+            <w:r>
+              <w:rPr>
                 <w:rFonts w:ascii="Tahoma" w:hAnsi="Tahoma" w:cs="Tahoma" w:hint="cs"/>
                 <w:sz w:val="18"/>
                 <w:szCs w:val="18"/>
                 <w:cs/>
               </w:rPr>
-            </w:pPr>
-            <w:r>
-              <w:rPr>
-                <w:rFonts w:ascii="Tahoma" w:hAnsi="Tahoma" w:cs="Tahoma"/>
-                <w:sz w:val="18"/>
-                <w:szCs w:val="18"/>
-                <w:cs/>
-              </w:rPr>
-              <w:t>รวมเอกสาร</w:t>
-            </w:r>
-            <w:r>
-              <w:rPr>
-                <w:rFonts w:ascii="Tahoma" w:hAnsi="Tahoma" w:cs="Tahoma"/>
-                <w:sz w:val="18"/>
-                <w:szCs w:val="18"/>
-                <w:cs/>
-              </w:rPr>
-              <w:t>ส่งให้พัสดุ</w:t>
+              <w:t xml:space="preserve"> </w:t>
+            </w:r>
+            <w:r>
+              <w:rPr>
+                <w:rFonts w:ascii="Tahoma" w:hAnsi="Tahoma" w:cs="Tahoma"/>
+                <w:sz w:val="18"/>
+                <w:szCs w:val="18"/>
+              </w:rPr>
+              <w:t>(</w:t>
             </w:r>
             <w:r>
               <w:rPr>
@@ -2930,81 +3031,131 @@
                 <w:szCs w:val="18"/>
                 <w:cs/>
               </w:rPr>
+              <w:t>รายเทอม)</w:t>
+            </w:r>
+          </w:p>
+        </w:tc>
+        <w:tc>
+          <w:tcPr>
+            <w:tcW w:w="1555" w:type="pct"/>
+          </w:tcPr>
+          <w:p>
+            <w:pPr>
+              <w:rPr>
+                <w:rFonts w:ascii="Tahoma" w:hAnsi="Tahoma" w:cs="Tahoma"/>
+                <w:sz w:val="18"/>
+                <w:szCs w:val="18"/>
+                <w:cs/>
+              </w:rPr>
+            </w:pPr>
+            <w:r>
+              <w:rPr>
+                <w:rFonts w:ascii="Tahoma" w:hAnsi="Tahoma" w:cs="Tahoma"/>
+                <w:sz w:val="18"/>
+                <w:szCs w:val="18"/>
+                <w:cs/>
+              </w:rPr>
+              <w:t xml:space="preserve">ไม่เกิน </w:t>
+            </w:r>
+            <w:r>
+              <w:rPr>
+                <w:rFonts w:ascii="Tahoma" w:hAnsi="Tahoma" w:cs="Tahoma"/>
+                <w:sz w:val="18"/>
+                <w:szCs w:val="18"/>
+              </w:rPr>
+              <w:t xml:space="preserve">2 </w:t>
+            </w:r>
+            <w:r>
+              <w:rPr>
+                <w:rFonts w:ascii="Tahoma" w:hAnsi="Tahoma" w:cs="Tahoma"/>
+                <w:sz w:val="18"/>
+                <w:szCs w:val="18"/>
+                <w:cs/>
+              </w:rPr>
+              <w:t>สัปดาห์หลังจากวันสุดท้ายของการเรียนการสอน</w:t>
+            </w:r>
+          </w:p>
+        </w:tc>
+        <w:tc>
+          <w:tcPr>
+            <w:tcW w:w="1562" w:type="pct"/>
+          </w:tcPr>
+          <w:p>
+            <w:pPr>
+              <w:rPr>
+                <w:rFonts w:ascii="Tahoma" w:hAnsi="Tahoma" w:cs="Tahoma" w:hint="cs"/>
+                <w:sz w:val="18"/>
+                <w:szCs w:val="18"/>
+                <w:cs/>
+              </w:rPr>
+            </w:pPr>
+            <w:r>
+              <w:rPr>
+                <w:rFonts w:ascii="Tahoma" w:hAnsi="Tahoma" w:cs="Tahoma" w:hint="cs"/>
+                <w:color w:val="4E67C8" w:themeColor="accent1"/>
+                <w:sz w:val="18"/>
+                <w:szCs w:val="18"/>
+                <w:cs/>
+              </w:rPr>
+              <w:t xml:space="preserve">(พัสดุ </w:t>
+            </w:r>
+            <w:r>
+              <w:rPr>
+                <w:rFonts w:ascii="Tahoma" w:hAnsi="Tahoma" w:cs="Tahoma"/>
+                <w:color w:val="4E67C8" w:themeColor="accent1"/>
+                <w:sz w:val="18"/>
+                <w:szCs w:val="18"/>
+              </w:rPr>
+              <w:t xml:space="preserve">3-5 </w:t>
+            </w:r>
+            <w:r>
+              <w:rPr>
+                <w:rFonts w:ascii="Tahoma" w:hAnsi="Tahoma" w:cs="Tahoma" w:hint="cs"/>
+                <w:color w:val="4E67C8" w:themeColor="accent1"/>
+                <w:sz w:val="18"/>
+                <w:szCs w:val="18"/>
+                <w:cs/>
+              </w:rPr>
+              <w:t>วัน)</w:t>
+            </w:r>
+            <w:r>
+              <w:rPr>
+                <w:rFonts w:ascii="Tahoma" w:hAnsi="Tahoma" w:cs="Tahoma"/>
+                <w:color w:val="4E67C8" w:themeColor="accent1"/>
+                <w:sz w:val="18"/>
+                <w:szCs w:val="18"/>
+              </w:rPr>
               <w:t xml:space="preserve"> </w:t>
             </w:r>
             <w:r>
               <w:rPr>
-                <w:rFonts w:ascii="Tahoma" w:hAnsi="Tahoma" w:cs="Tahoma"/>
-                <w:sz w:val="18"/>
-                <w:szCs w:val="18"/>
-              </w:rPr>
-              <w:t>(</w:t>
-            </w:r>
-            <w:r>
-              <w:rPr>
                 <w:rFonts w:ascii="Tahoma" w:hAnsi="Tahoma" w:cs="Tahoma" w:hint="cs"/>
-                <w:sz w:val="18"/>
-                <w:szCs w:val="18"/>
-                <w:cs/>
-              </w:rPr>
-              <w:t>รายเทอม)</w:t>
-            </w:r>
-          </w:p>
-        </w:tc>
-        <w:tc>
-          <w:tcPr>
-            <w:tcW w:w="1555" w:type="pct"/>
-          </w:tcPr>
-          <w:p>
-            <w:pPr>
-              <w:rPr>
-                <w:rFonts w:ascii="Tahoma" w:hAnsi="Tahoma" w:cs="Tahoma"/>
-                <w:sz w:val="18"/>
-                <w:szCs w:val="18"/>
-                <w:cs/>
-              </w:rPr>
-            </w:pPr>
-            <w:r>
-              <w:rPr>
-                <w:rFonts w:ascii="Tahoma" w:hAnsi="Tahoma" w:cs="Tahoma"/>
-                <w:sz w:val="18"/>
-                <w:szCs w:val="18"/>
-                <w:cs/>
-              </w:rPr>
-              <w:t xml:space="preserve">ไม่เกิน </w:t>
-            </w:r>
-            <w:r>
-              <w:rPr>
-                <w:rFonts w:ascii="Tahoma" w:hAnsi="Tahoma" w:cs="Tahoma"/>
-                <w:sz w:val="18"/>
-                <w:szCs w:val="18"/>
-              </w:rPr>
-              <w:t xml:space="preserve">2 </w:t>
-            </w:r>
-            <w:r>
-              <w:rPr>
-                <w:rFonts w:ascii="Tahoma" w:hAnsi="Tahoma" w:cs="Tahoma"/>
-                <w:sz w:val="18"/>
-                <w:szCs w:val="18"/>
-                <w:cs/>
-              </w:rPr>
-              <w:t>สัปดาห์หลังจากวันสุดท้ายของการเรียนการสอน</w:t>
-            </w:r>
-          </w:p>
-        </w:tc>
-        <w:tc>
-          <w:tcPr>
-            <w:tcW w:w="1562" w:type="pct"/>
-          </w:tcPr>
-          <w:p>
-            <w:pPr>
-              <w:rPr>
-                <w:rFonts w:ascii="Tahoma" w:hAnsi="Tahoma" w:cs="Tahoma"/>
-                <w:sz w:val="18"/>
-                <w:szCs w:val="18"/>
-                <w:cs/>
-              </w:rPr>
-            </w:pPr>
+                <w:color w:val="4E67C8" w:themeColor="accent1"/>
+                <w:sz w:val="18"/>
+                <w:szCs w:val="18"/>
+                <w:cs/>
+              </w:rPr>
+              <w:t xml:space="preserve">ได้เงินไม่เกิน </w:t>
+            </w:r>
+            <w:r>
+              <w:rPr>
+                <w:rFonts w:ascii="Tahoma" w:hAnsi="Tahoma" w:cs="Tahoma"/>
+                <w:color w:val="4E67C8" w:themeColor="accent1"/>
+                <w:sz w:val="18"/>
+                <w:szCs w:val="18"/>
+              </w:rPr>
+              <w:t xml:space="preserve">1 </w:t>
+            </w:r>
+            <w:r>
+              <w:rPr>
+                <w:rFonts w:ascii="Tahoma" w:hAnsi="Tahoma" w:cs="Tahoma" w:hint="cs"/>
+                <w:color w:val="4E67C8" w:themeColor="accent1"/>
+                <w:sz w:val="18"/>
+                <w:szCs w:val="18"/>
+                <w:cs/>
+              </w:rPr>
+              <w:t>เดือนหลังสอนเสร็จ</w:t>
+            </w:r>
           </w:p>
         </w:tc>
       </w:tr>
@@ -3021,9 +3172,10 @@
           <w:p>
             <w:pPr>
               <w:rPr>
-                <w:rFonts w:ascii="Tahoma" w:hAnsi="Tahoma" w:cs="Tahoma"/>
-                <w:sz w:val="18"/>
-                <w:szCs w:val="18"/>
+                <w:rFonts w:ascii="Tahoma" w:hAnsi="Tahoma" w:cs="Tahoma" w:hint="cs"/>
+                <w:sz w:val="18"/>
+                <w:szCs w:val="18"/>
+                <w:cs/>
               </w:rPr>
             </w:pPr>
             <w:r>
@@ -3060,7 +3212,16 @@
                 <w:szCs w:val="18"/>
                 <w:cs/>
               </w:rPr>
-              <w:t xml:space="preserve"> และปริญญาตรี</w:t>
+              <w:t>และปริญญาตรี</w:t>
+            </w:r>
+            <w:r>
+              <w:rPr>
+                <w:rFonts w:ascii="Tahoma" w:hAnsi="Tahoma" w:cs="Tahoma" w:hint="cs"/>
+                <w:sz w:val="18"/>
+                <w:szCs w:val="18"/>
+                <w:cs/>
+              </w:rPr>
+              <w:t>)</w:t>
             </w:r>
           </w:p>
         </w:tc>
@@ -3526,6 +3687,7 @@
                 <w:szCs w:val="18"/>
                 <w:cs/>
               </w:rPr>
+              <w:lastRenderedPageBreak/>
               <w:t xml:space="preserve">ยกเว้นเดือนสุดท้ายของการเรียนการสอน </w:t>
             </w:r>
             <w:r>

</xml_diff>